<commit_message>
build: refresh dist after P5 IJOEM retarget
Regenerates reading copies (dist/downloads, dist/manuscripts) and the
P3/P4/P5 submission rebuilds (dist/submission) so all P5 deliverables
reflect the IJOEM retarget (no stale apjm/ references). P5 dist/manuscripts
mirror refreshed directly from edited sources (no script builds that tree).

https://claude.ai/code/session_01TNqoRFY1vAVQL6GWg8X9M3
</commit_message>
<xml_diff>
--- a/dist/downloads/manuscripts_en/p5_china_en.docx
+++ b/dist/downloads/manuscripts_en/p5_china_en.docx
@@ -7258,7 +7258,7 @@
           <w:iCs/>
           <w:i/>
         </w:rPr>
-        <w:t xml:space="preserve">apjm/</w:t>
+        <w:t xml:space="preserve">ijoem/</w:t>
       </w:r>
       <w:r>
         <w:rPr>
@@ -7272,7 +7272,7 @@
           <w:iCs/>
           <w:i/>
         </w:rPr>
-        <w:t xml:space="preserve">subfolders. The complete v1.8 manuscript is assembled from six section parts (</w:t>
+        <w:t xml:space="preserve">subfolders. The complete v1.8 manuscript is assembled from the section parts (</w:t>
       </w:r>
       <w:r>
         <w:rPr>
@@ -7280,7 +7280,7 @@
           <w:iCs/>
           <w:i/>
         </w:rPr>
-        <w:t xml:space="preserve">apjm/manuscript_v1_8_blinded_part{1,2,3,4,5,6}_*.md</w:t>
+        <w:t xml:space="preserve">ijoem/manuscript_v1_8_blinded_part{1,2,3,4,5,6,7}_*.md</w:t>
       </w:r>
       <w:r>
         <w:rPr>
@@ -7302,7 +7302,7 @@
           <w:iCs/>
           <w:i/>
         </w:rPr>
-        <w:t xml:space="preserve">apjm/build_docx.sh</w:t>
+        <w:t xml:space="preserve">ijoem/build_docx.sh</w:t>
       </w:r>
       <w:r>
         <w:rPr>
@@ -7317,7 +7317,7 @@
           <w:iCs/>
           <w:i/>
         </w:rPr>
-        <w:t xml:space="preserve">apjm/VERIFICATION_RESULTS.md</w:t>
+        <w:t xml:space="preserve">ijoem/CITATION_AUDIT.md</w:t>
       </w:r>
       <w:r>
         <w:rPr>

</xml_diff>